<commit_message>
ca7 reply-brief docx: Times New Roman 12 pt body and 11 pt footnotes (Cir. R. 32(b); the typst face) via docx/reference.xml (build-reference.sh named EB Garamond: TNR-EMBEDDED, DEF-FONT-002); TOC and TOA page numbers from fb render's multi-pass engine (needles for headings and citations, footnote citations on their page, rIdFtr footers, FORMBOOK_FINAL), retiring render.sh, pagemap.awk and footer.xml; certificate names the face used; README typeface line corrected; check.sh --engine docx 20 passed 0 failed on both samples (fb-595.63)
</commit_message>
<xml_diff>
--- a/courts/seventh-circuit/court-of-appeals/reply-brief/usage/OUTPUT-reply-brief.docx
+++ b/courts/seventh-circuit/court-of-appeals/reply-brief/usage/OUTPUT-reply-brief.docx
@@ -412,25 +412,52 @@
               <w:br/>
             </w:r>
             <w:r>
-              <w:t xml:space="preserve">(application</w:t>
-            </w:r>
-            <w:r>
-              <w:t xml:space="preserve"> </w:t>
-            </w:r>
-            <w:r>
+              <w:t xml:space="preserve">(</w:t>
+            </w:r>
+            <w:r>
+              <w:rPr>
+                <w:i/>
+              </w:rPr>
+              <w:t xml:space="preserve">application</w:t>
+            </w:r>
+            <w:r>
+              <w:rPr>
+                <w:i/>
+              </w:rPr>
+              <w:t xml:space="preserve"> </w:t>
+            </w:r>
+            <w:r>
+              <w:rPr>
+                <w:i/>
+              </w:rPr>
               <w:t xml:space="preserve">for</w:t>
             </w:r>
             <w:r>
-              <w:t xml:space="preserve"> </w:t>
-            </w:r>
-            <w:r>
+              <w:rPr>
+                <w:i/>
+              </w:rPr>
+              <w:t xml:space="preserve"> </w:t>
+            </w:r>
+            <w:r>
+              <w:rPr>
+                <w:i/>
+              </w:rPr>
               <w:t xml:space="preserve">admission</w:t>
             </w:r>
             <w:r>
-              <w:t xml:space="preserve"> </w:t>
-            </w:r>
-            <w:r>
-              <w:t xml:space="preserve">pending)</w:t>
+              <w:rPr>
+                <w:i/>
+              </w:rPr>
+              <w:t xml:space="preserve"> </w:t>
+            </w:r>
+            <w:r>
+              <w:rPr>
+                <w:i/>
+              </w:rPr>
+              <w:t xml:space="preserve">pending</w:t>
+            </w:r>
+            <w:r>
+              <w:t xml:space="preserve">)</w:t>
             </w:r>
             <w:r>
               <w:br/>
@@ -454,25 +481,52 @@
               <w:br/>
             </w:r>
             <w:r>
-              <w:t xml:space="preserve">(admission</w:t>
-            </w:r>
-            <w:r>
-              <w:t xml:space="preserve"> </w:t>
-            </w:r>
-            <w:r>
+              <w:t xml:space="preserve">(</w:t>
+            </w:r>
+            <w:r>
+              <w:rPr>
+                <w:i/>
+              </w:rPr>
+              <w:t xml:space="preserve">admission</w:t>
+            </w:r>
+            <w:r>
+              <w:rPr>
+                <w:i/>
+              </w:rPr>
+              <w:t xml:space="preserve"> </w:t>
+            </w:r>
+            <w:r>
+              <w:rPr>
+                <w:i/>
+              </w:rPr>
               <w:t xml:space="preserve">for</w:t>
             </w:r>
             <w:r>
-              <w:t xml:space="preserve"> </w:t>
-            </w:r>
-            <w:r>
+              <w:rPr>
+                <w:i/>
+              </w:rPr>
+              <w:t xml:space="preserve"> </w:t>
+            </w:r>
+            <w:r>
+              <w:rPr>
+                <w:i/>
+              </w:rPr>
               <w:t xml:space="preserve">application</w:t>
             </w:r>
             <w:r>
-              <w:t xml:space="preserve"> </w:t>
-            </w:r>
-            <w:r>
-              <w:t xml:space="preserve">pending)</w:t>
+              <w:rPr>
+                <w:i/>
+              </w:rPr>
+              <w:t xml:space="preserve"> </w:t>
+            </w:r>
+            <w:r>
+              <w:rPr>
+                <w:i/>
+              </w:rPr>
+              <w:t xml:space="preserve">pending</w:t>
+            </w:r>
+            <w:r>
+              <w:t xml:space="preserve">)</w:t>
             </w:r>
             <w:r>
               <w:br/>
@@ -1379,7 +1433,10 @@
     </w:p>
     <w:p>
       <w:pPr>
+        <w:spacing w:before="0" w:after="0" w:line="20" w:lineRule="exact"/>
         <w:sectPr>
+          <w:footerReference w:type="default" r:id="rIdFtrNone"/>
+          <w:type w:val="nextPage"/>
           <w:pgSz w:w="12240" w:h="15840"/>
           <w:pgMar w:top="1440" w:right="1440" w:bottom="1440" w:left="1440" w:header="720" w:footer="720" w:gutter="0"/>
           <w:pgNumType w:fmt="lowerRoman" w:start="1"/>
@@ -1818,10 +1875,304 @@
     </w:p>
     <w:p>
       <w:pPr>
+        <w:pStyle w:val="CATocS2"/>
+      </w:pPr>
+      <w:r>
+        <w:t xml:space="preserve">B.</w:t>
+      </w:r>
+      <w:r>
+        <w:tab/>
+      </w:r>
+      <w:r>
+        <w:t xml:space="preserve">Even</w:t>
+      </w:r>
+      <w:r>
+        <w:t xml:space="preserve"> </w:t>
+      </w:r>
+      <w:r>
+        <w:t xml:space="preserve">if</w:t>
+      </w:r>
+      <w:r>
+        <w:t xml:space="preserve"> </w:t>
+      </w:r>
+      <w:r>
+        <w:t xml:space="preserve">the</w:t>
+      </w:r>
+      <w:r>
+        <w:t xml:space="preserve"> </w:t>
+      </w:r>
+      <w:r>
+        <w:t xml:space="preserve">Department</w:t>
+      </w:r>
+      <w:r>
+        <w:t xml:space="preserve"> </w:t>
+      </w:r>
+      <w:r>
+        <w:t xml:space="preserve">Was</w:t>
+      </w:r>
+      <w:r>
+        <w:t xml:space="preserve"> </w:t>
+      </w:r>
+      <w:r>
+        <w:t xml:space="preserve">Enforcing</w:t>
+      </w:r>
+      <w:r>
+        <w:t xml:space="preserve"> </w:t>
+      </w:r>
+      <w:r>
+        <w:t xml:space="preserve">a</w:t>
+      </w:r>
+      <w:r>
+        <w:t xml:space="preserve"> </w:t>
+      </w:r>
+      <w:r>
+        <w:t xml:space="preserve">Funding</w:t>
+      </w:r>
+      <w:r>
+        <w:t xml:space="preserve"> </w:t>
+      </w:r>
+      <w:r>
+        <w:t xml:space="preserve">Condition</w:t>
+      </w:r>
+      <w:r>
+        <w:t xml:space="preserve"> </w:t>
+      </w:r>
+      <w:r>
+        <w:t xml:space="preserve">Imposed</w:t>
+      </w:r>
+      <w:r>
+        <w:t xml:space="preserve"> </w:t>
+      </w:r>
+      <w:r>
+        <w:t xml:space="preserve">by</w:t>
+      </w:r>
+      <w:r>
+        <w:t xml:space="preserve"> </w:t>
+      </w:r>
+      <w:r>
+        <w:t xml:space="preserve">Congress,</w:t>
+      </w:r>
+      <w:r>
+        <w:t xml:space="preserve"> </w:t>
+      </w:r>
+      <w:r>
+        <w:t xml:space="preserve">Such</w:t>
+      </w:r>
+      <w:r>
+        <w:t xml:space="preserve"> </w:t>
+      </w:r>
+      <w:r>
+        <w:t xml:space="preserve">a</w:t>
+      </w:r>
+      <w:r>
+        <w:t xml:space="preserve"> </w:t>
+      </w:r>
+      <w:r>
+        <w:t xml:space="preserve">Funding</w:t>
+      </w:r>
+      <w:r>
+        <w:t xml:space="preserve"> </w:t>
+      </w:r>
+      <w:r>
+        <w:t xml:space="preserve">Condition</w:t>
+      </w:r>
+      <w:r>
+        <w:t xml:space="preserve"> </w:t>
+      </w:r>
+      <w:r>
+        <w:t xml:space="preserve">Is</w:t>
+      </w:r>
+      <w:r>
+        <w:t xml:space="preserve"> </w:t>
+      </w:r>
+      <w:r>
+        <w:t xml:space="preserve">Viewpoint</w:t>
+      </w:r>
+      <w:r>
+        <w:t xml:space="preserve"> </w:t>
+      </w:r>
+      <w:r>
+        <w:t xml:space="preserve">Discrimination</w:t>
+      </w:r>
+      <w:r>
+        <w:t xml:space="preserve"> </w:t>
+      </w:r>
+      <w:r>
+        <w:t xml:space="preserve">Prohibited</w:t>
+      </w:r>
+      <w:r>
+        <w:t xml:space="preserve"> </w:t>
+      </w:r>
+      <w:r>
+        <w:t xml:space="preserve">Under</w:t>
+      </w:r>
+      <w:r>
+        <w:t xml:space="preserve"> </w:t>
+      </w:r>
+      <w:r>
+        <w:t xml:space="preserve">the</w:t>
+      </w:r>
+      <w:r>
+        <w:t xml:space="preserve"> </w:t>
+      </w:r>
+      <w:r>
+        <w:t xml:space="preserve">Selective-Subsidy</w:t>
+      </w:r>
+      <w:r>
+        <w:t xml:space="preserve"> </w:t>
+      </w:r>
+      <w:r>
+        <w:t xml:space="preserve">Cases.</w:t>
+      </w:r>
+      <w:r>
+        <w:tab/>
+      </w:r>
+      <w:r>
+        <w:t xml:space="preserve">7</w:t>
+      </w:r>
+    </w:p>
+    <w:p>
+      <w:pPr>
+        <w:pStyle w:val="CATocS2"/>
+      </w:pPr>
+      <w:r>
+        <w:t xml:space="preserve">C.</w:t>
+      </w:r>
+      <w:r>
+        <w:tab/>
+      </w:r>
+      <w:r>
+        <w:t xml:space="preserve">Plaintiffs</w:t>
+      </w:r>
+      <w:r>
+        <w:t xml:space="preserve"> </w:t>
+      </w:r>
+      <w:r>
+        <w:t xml:space="preserve">Did</w:t>
+      </w:r>
+      <w:r>
+        <w:t xml:space="preserve"> </w:t>
+      </w:r>
+      <w:r>
+        <w:t xml:space="preserve">Not</w:t>
+      </w:r>
+      <w:r>
+        <w:t xml:space="preserve"> </w:t>
+      </w:r>
+      <w:r>
+        <w:t xml:space="preserve">Waive</w:t>
+      </w:r>
+      <w:r>
+        <w:t xml:space="preserve"> </w:t>
+      </w:r>
+      <w:r>
+        <w:t xml:space="preserve">Their</w:t>
+      </w:r>
+      <w:r>
+        <w:t xml:space="preserve"> </w:t>
+      </w:r>
+      <w:r>
+        <w:t xml:space="preserve">Argument.</w:t>
+      </w:r>
+      <w:r>
+        <w:tab/>
+      </w:r>
+      <w:r>
+        <w:t xml:space="preserve">7</w:t>
+      </w:r>
+    </w:p>
+    <w:p>
+      <w:pPr>
         <w:pStyle w:val="CATocS1"/>
       </w:pPr>
       <w:r>
         <w:t xml:space="preserve">III.</w:t>
+      </w:r>
+      <w:r>
+        <w:tab/>
+      </w:r>
+      <w:r>
+        <w:t xml:space="preserve">The</w:t>
+      </w:r>
+      <w:r>
+        <w:t xml:space="preserve"> </w:t>
+      </w:r>
+      <w:r>
+        <w:t xml:space="preserve">Court</w:t>
+      </w:r>
+      <w:r>
+        <w:t xml:space="preserve"> </w:t>
+      </w:r>
+      <w:r>
+        <w:t xml:space="preserve">Erred</w:t>
+      </w:r>
+      <w:r>
+        <w:t xml:space="preserve"> </w:t>
+      </w:r>
+      <w:r>
+        <w:t xml:space="preserve">in</w:t>
+      </w:r>
+      <w:r>
+        <w:t xml:space="preserve"> </w:t>
+      </w:r>
+      <w:r>
+        <w:t xml:space="preserve">Failing</w:t>
+      </w:r>
+      <w:r>
+        <w:t xml:space="preserve"> </w:t>
+      </w:r>
+      <w:r>
+        <w:t xml:space="preserve">to</w:t>
+      </w:r>
+      <w:r>
+        <w:t xml:space="preserve"> </w:t>
+      </w:r>
+      <w:r>
+        <w:t xml:space="preserve">Make</w:t>
+      </w:r>
+      <w:r>
+        <w:t xml:space="preserve"> </w:t>
+      </w:r>
+      <w:r>
+        <w:t xml:space="preserve">any</w:t>
+      </w:r>
+      <w:r>
+        <w:t xml:space="preserve"> </w:t>
+      </w:r>
+      <w:r>
+        <w:t xml:space="preserve">Findings</w:t>
+      </w:r>
+      <w:r>
+        <w:t xml:space="preserve"> </w:t>
+      </w:r>
+      <w:r>
+        <w:t xml:space="preserve">of</w:t>
+      </w:r>
+      <w:r>
+        <w:t xml:space="preserve"> </w:t>
+      </w:r>
+      <w:r>
+        <w:t xml:space="preserve">Irreparable</w:t>
+      </w:r>
+      <w:r>
+        <w:t xml:space="preserve"> </w:t>
+      </w:r>
+      <w:r>
+        <w:t xml:space="preserve">Harm.</w:t>
+      </w:r>
+      <w:r>
+        <w:tab/>
+      </w:r>
+      <w:r>
+        <w:t xml:space="preserve">7</w:t>
+      </w:r>
+    </w:p>
+    <w:p>
+      <w:pPr>
+        <w:pStyle w:val="CATocS1"/>
+      </w:pPr>
+      <w:r>
+        <w:t xml:space="preserve">IV.</w:t>
       </w:r>
       <w:r>
         <w:tab/>
@@ -2023,521 +2374,523 @@
         <w:tab/>
       </w:r>
       <w:r>
+        <w:t xml:space="preserve">6, 7</w:t>
+      </w:r>
+    </w:p>
+    <w:p>
+      <w:pPr>
+        <w:pStyle w:val="CAToaEntry"/>
+      </w:pPr>
+      <w:r>
+        <w:rPr>
+          <w:i/>
+        </w:rPr>
+        <w:t xml:space="preserve">Argyropoulos</w:t>
+      </w:r>
+      <w:r>
+        <w:rPr>
+          <w:i/>
+        </w:rPr>
+        <w:t xml:space="preserve"> </w:t>
+      </w:r>
+      <w:r>
+        <w:rPr>
+          <w:i/>
+        </w:rPr>
+        <w:t xml:space="preserve">v.</w:t>
+      </w:r>
+      <w:r>
+        <w:rPr>
+          <w:i/>
+        </w:rPr>
+        <w:t xml:space="preserve"> </w:t>
+      </w:r>
+      <w:r>
+        <w:rPr>
+          <w:i/>
+        </w:rPr>
+        <w:t xml:space="preserve">City</w:t>
+      </w:r>
+      <w:r>
+        <w:rPr>
+          <w:i/>
+        </w:rPr>
+        <w:t xml:space="preserve"> </w:t>
+      </w:r>
+      <w:r>
+        <w:rPr>
+          <w:i/>
+        </w:rPr>
+        <w:t xml:space="preserve">of</w:t>
+      </w:r>
+      <w:r>
+        <w:rPr>
+          <w:i/>
+        </w:rPr>
+        <w:t xml:space="preserve"> </w:t>
+      </w:r>
+      <w:r>
+        <w:rPr>
+          <w:i/>
+        </w:rPr>
+        <w:t xml:space="preserve">Alton</w:t>
+      </w:r>
+      <w:r>
+        <w:t xml:space="preserve">,</w:t>
+      </w:r>
+      <w:r>
+        <w:br/>
+      </w:r>
+      <w:r>
+        <w:t xml:space="preserve">539</w:t>
+      </w:r>
+      <w:r>
+        <w:t xml:space="preserve"> </w:t>
+      </w:r>
+      <w:r>
+        <w:t xml:space="preserve">F.3d</w:t>
+      </w:r>
+      <w:r>
+        <w:t xml:space="preserve"> </w:t>
+      </w:r>
+      <w:r>
+        <w:t xml:space="preserve">724</w:t>
+      </w:r>
+      <w:r>
+        <w:t xml:space="preserve"> </w:t>
+      </w:r>
+      <w:r>
+        <w:t xml:space="preserve">(7th</w:t>
+      </w:r>
+      <w:r>
+        <w:t xml:space="preserve"> </w:t>
+      </w:r>
+      <w:r>
+        <w:t xml:space="preserve">Cir.</w:t>
+      </w:r>
+      <w:r>
+        <w:t xml:space="preserve"> </w:t>
+      </w:r>
+      <w:r>
+        <w:t xml:space="preserve">2008)</w:t>
+      </w:r>
+      <w:r>
+        <w:tab/>
+      </w:r>
+      <w:r>
+        <w:t xml:space="preserve">4</w:t>
+      </w:r>
+    </w:p>
+    <w:p>
+      <w:pPr>
+        <w:pStyle w:val="CAToaEntry"/>
+      </w:pPr>
+      <w:r>
+        <w:rPr>
+          <w:i/>
+        </w:rPr>
+        <w:t xml:space="preserve">California,</w:t>
+      </w:r>
+      <w:r>
+        <w:rPr>
+          <w:i/>
+        </w:rPr>
+        <w:t xml:space="preserve"> </w:t>
+      </w:r>
+      <w:r>
+        <w:rPr>
+          <w:i/>
+        </w:rPr>
+        <w:t xml:space="preserve">et</w:t>
+      </w:r>
+      <w:r>
+        <w:rPr>
+          <w:i/>
+        </w:rPr>
+        <w:t xml:space="preserve"> </w:t>
+      </w:r>
+      <w:r>
+        <w:rPr>
+          <w:i/>
+        </w:rPr>
+        <w:t xml:space="preserve">al. v.</w:t>
+      </w:r>
+      <w:r>
+        <w:rPr>
+          <w:i/>
+        </w:rPr>
+        <w:t xml:space="preserve"> </w:t>
+      </w:r>
+      <w:r>
+        <w:rPr>
+          <w:i/>
+        </w:rPr>
+        <w:t xml:space="preserve">Dep’t</w:t>
+      </w:r>
+      <w:r>
+        <w:rPr>
+          <w:i/>
+        </w:rPr>
+        <w:t xml:space="preserve"> </w:t>
+      </w:r>
+      <w:r>
+        <w:rPr>
+          <w:i/>
+        </w:rPr>
+        <w:t xml:space="preserve">of</w:t>
+      </w:r>
+      <w:r>
+        <w:rPr>
+          <w:i/>
+        </w:rPr>
+        <w:t xml:space="preserve"> </w:t>
+      </w:r>
+      <w:r>
+        <w:rPr>
+          <w:i/>
+        </w:rPr>
+        <w:t xml:space="preserve">Ed.,</w:t>
+      </w:r>
+      <w:r>
+        <w:rPr>
+          <w:i/>
+        </w:rPr>
+        <w:t xml:space="preserve"> </w:t>
+      </w:r>
+      <w:r>
+        <w:rPr>
+          <w:i/>
+        </w:rPr>
+        <w:t xml:space="preserve">et</w:t>
+      </w:r>
+      <w:r>
+        <w:rPr>
+          <w:i/>
+        </w:rPr>
+        <w:t xml:space="preserve"> </w:t>
+      </w:r>
+      <w:r>
+        <w:rPr>
+          <w:i/>
+        </w:rPr>
+        <w:t xml:space="preserve">al.</w:t>
+      </w:r>
+      <w:r>
+        <w:t xml:space="preserve">,</w:t>
+      </w:r>
+      <w:r>
+        <w:br/>
+      </w:r>
+      <w:r>
+        <w:t xml:space="preserve">No. 25-CV-10548,</w:t>
+      </w:r>
+      <w:r>
+        <w:t xml:space="preserve"> </w:t>
+      </w:r>
+      <w:r>
+        <w:t xml:space="preserve">Mem.</w:t>
+      </w:r>
+      <w:r>
+        <w:t xml:space="preserve"> </w:t>
+      </w:r>
+      <w:r>
+        <w:t xml:space="preserve">and</w:t>
+      </w:r>
+      <w:r>
+        <w:t xml:space="preserve"> </w:t>
+      </w:r>
+      <w:r>
+        <w:t xml:space="preserve">Order,</w:t>
+      </w:r>
+      <w:r>
+        <w:t xml:space="preserve"> </w:t>
+      </w:r>
+      <w:r>
+        <w:t xml:space="preserve">ECF</w:t>
+      </w:r>
+      <w:r>
+        <w:t xml:space="preserve"> </w:t>
+      </w:r>
+      <w:r>
+        <w:t xml:space="preserve">No. 176</w:t>
+      </w:r>
+      <w:r>
+        <w:t xml:space="preserve"> </w:t>
+      </w:r>
+      <w:r>
+        <w:t xml:space="preserve">(D.</w:t>
+      </w:r>
+      <w:r>
+        <w:t xml:space="preserve"> </w:t>
+      </w:r>
+      <w:r>
+        <w:t xml:space="preserve">Mass.</w:t>
+      </w:r>
+      <w:r>
+        <w:t xml:space="preserve"> </w:t>
+      </w:r>
+      <w:r>
+        <w:t xml:space="preserve">Sept. 17,</w:t>
+      </w:r>
+      <w:r>
+        <w:t xml:space="preserve"> </w:t>
+      </w:r>
+      <w:r>
+        <w:t xml:space="preserve">2026)</w:t>
+      </w:r>
+      <w:r>
+        <w:tab/>
+      </w:r>
+      <w:r>
+        <w:t xml:space="preserve">2</w:t>
+      </w:r>
+    </w:p>
+    <w:p>
+      <w:pPr>
+        <w:pStyle w:val="CAToaEntry"/>
+      </w:pPr>
+      <w:r>
+        <w:rPr>
+          <w:i/>
+        </w:rPr>
+        <w:t xml:space="preserve">FKFJ,</w:t>
+      </w:r>
+      <w:r>
+        <w:rPr>
+          <w:i/>
+        </w:rPr>
+        <w:t xml:space="preserve"> </w:t>
+      </w:r>
+      <w:r>
+        <w:rPr>
+          <w:i/>
+        </w:rPr>
+        <w:t xml:space="preserve">Inc. v.</w:t>
+      </w:r>
+      <w:r>
+        <w:rPr>
+          <w:i/>
+        </w:rPr>
+        <w:t xml:space="preserve"> </w:t>
+      </w:r>
+      <w:r>
+        <w:rPr>
+          <w:i/>
+        </w:rPr>
+        <w:t xml:space="preserve">Village</w:t>
+      </w:r>
+      <w:r>
+        <w:rPr>
+          <w:i/>
+        </w:rPr>
+        <w:t xml:space="preserve"> </w:t>
+      </w:r>
+      <w:r>
+        <w:rPr>
+          <w:i/>
+        </w:rPr>
+        <w:t xml:space="preserve">of</w:t>
+      </w:r>
+      <w:r>
+        <w:rPr>
+          <w:i/>
+        </w:rPr>
+        <w:t xml:space="preserve"> </w:t>
+      </w:r>
+      <w:r>
+        <w:rPr>
+          <w:i/>
+        </w:rPr>
+        <w:t xml:space="preserve">Worth</w:t>
+      </w:r>
+      <w:r>
+        <w:t xml:space="preserve">,</w:t>
+      </w:r>
+      <w:r>
+        <w:br/>
+      </w:r>
+      <w:r>
+        <w:t xml:space="preserve">11</w:t>
+      </w:r>
+      <w:r>
+        <w:t xml:space="preserve"> </w:t>
+      </w:r>
+      <w:r>
+        <w:t xml:space="preserve">F.4th</w:t>
+      </w:r>
+      <w:r>
+        <w:t xml:space="preserve"> </w:t>
+      </w:r>
+      <w:r>
+        <w:t xml:space="preserve">574</w:t>
+      </w:r>
+      <w:r>
+        <w:t xml:space="preserve"> </w:t>
+      </w:r>
+      <w:r>
+        <w:t xml:space="preserve">(7th</w:t>
+      </w:r>
+      <w:r>
+        <w:t xml:space="preserve"> </w:t>
+      </w:r>
+      <w:r>
+        <w:t xml:space="preserve">Cir.</w:t>
+      </w:r>
+      <w:r>
+        <w:t xml:space="preserve"> </w:t>
+      </w:r>
+      <w:r>
+        <w:t xml:space="preserve">2021)</w:t>
+      </w:r>
+      <w:r>
+        <w:tab/>
+      </w:r>
+      <w:r>
+        <w:t xml:space="preserve">5</w:t>
+      </w:r>
+    </w:p>
+    <w:p>
+      <w:pPr>
+        <w:pStyle w:val="CAToaEntry"/>
+      </w:pPr>
+      <w:r>
+        <w:rPr>
+          <w:i/>
+        </w:rPr>
+        <w:t xml:space="preserve">Nieves</w:t>
+      </w:r>
+      <w:r>
+        <w:rPr>
+          <w:i/>
+        </w:rPr>
+        <w:t xml:space="preserve"> </w:t>
+      </w:r>
+      <w:r>
+        <w:rPr>
+          <w:i/>
+        </w:rPr>
+        <w:t xml:space="preserve">v.</w:t>
+      </w:r>
+      <w:r>
+        <w:rPr>
+          <w:i/>
+        </w:rPr>
+        <w:t xml:space="preserve"> </w:t>
+      </w:r>
+      <w:r>
+        <w:rPr>
+          <w:i/>
+        </w:rPr>
+        <w:t xml:space="preserve">Bartlett</w:t>
+      </w:r>
+      <w:r>
+        <w:t xml:space="preserve">,</w:t>
+      </w:r>
+      <w:r>
+        <w:br/>
+      </w:r>
+      <w:r>
+        <w:t xml:space="preserve">587</w:t>
+      </w:r>
+      <w:r>
+        <w:t xml:space="preserve"> </w:t>
+      </w:r>
+      <w:r>
+        <w:t xml:space="preserve">U.S.</w:t>
+      </w:r>
+      <w:r>
+        <w:t xml:space="preserve"> </w:t>
+      </w:r>
+      <w:r>
+        <w:t xml:space="preserve">391</w:t>
+      </w:r>
+      <w:r>
+        <w:t xml:space="preserve"> </w:t>
+      </w:r>
+      <w:r>
+        <w:t xml:space="preserve">(2019)</w:t>
+      </w:r>
+      <w:r>
+        <w:tab/>
+      </w:r>
+      <w:r>
+        <w:t xml:space="preserve">5</w:t>
+      </w:r>
+    </w:p>
+    <w:p>
+      <w:pPr>
+        <w:pStyle w:val="CAToaEntry"/>
+      </w:pPr>
+      <w:r>
+        <w:rPr>
+          <w:i/>
+        </w:rPr>
+        <w:t xml:space="preserve">Rust</w:t>
+      </w:r>
+      <w:r>
+        <w:rPr>
+          <w:i/>
+        </w:rPr>
+        <w:t xml:space="preserve"> </w:t>
+      </w:r>
+      <w:r>
+        <w:rPr>
+          <w:i/>
+        </w:rPr>
+        <w:t xml:space="preserve">v.</w:t>
+      </w:r>
+      <w:r>
+        <w:rPr>
+          <w:i/>
+        </w:rPr>
+        <w:t xml:space="preserve"> </w:t>
+      </w:r>
+      <w:r>
+        <w:rPr>
+          <w:i/>
+        </w:rPr>
+        <w:t xml:space="preserve">Sullivan</w:t>
+      </w:r>
+      <w:r>
+        <w:t xml:space="preserve">,</w:t>
+      </w:r>
+      <w:r>
+        <w:br/>
+      </w:r>
+      <w:r>
+        <w:t xml:space="preserve">500</w:t>
+      </w:r>
+      <w:r>
+        <w:t xml:space="preserve"> </w:t>
+      </w:r>
+      <w:r>
+        <w:t xml:space="preserve">U.S.</w:t>
+      </w:r>
+      <w:r>
+        <w:t xml:space="preserve"> </w:t>
+      </w:r>
+      <w:r>
+        <w:t xml:space="preserve">173</w:t>
+      </w:r>
+      <w:r>
+        <w:t xml:space="preserve"> </w:t>
+      </w:r>
+      <w:r>
+        <w:t xml:space="preserve">(1991)</w:t>
+      </w:r>
+      <w:r>
+        <w:tab/>
+      </w:r>
+      <w:r>
         <w:t xml:space="preserve">6</w:t>
       </w:r>
     </w:p>
     <w:p>
       <w:pPr>
-        <w:pStyle w:val="CAToaEntry"/>
-      </w:pPr>
-      <w:r>
-        <w:rPr>
-          <w:i/>
-        </w:rPr>
-        <w:t xml:space="preserve">Argyropoulos</w:t>
-      </w:r>
-      <w:r>
-        <w:rPr>
-          <w:i/>
-        </w:rPr>
-        <w:t xml:space="preserve"> </w:t>
-      </w:r>
-      <w:r>
-        <w:rPr>
-          <w:i/>
-        </w:rPr>
-        <w:t xml:space="preserve">v.</w:t>
-      </w:r>
-      <w:r>
-        <w:rPr>
-          <w:i/>
-        </w:rPr>
-        <w:t xml:space="preserve"> </w:t>
-      </w:r>
-      <w:r>
-        <w:rPr>
-          <w:i/>
-        </w:rPr>
-        <w:t xml:space="preserve">City</w:t>
-      </w:r>
-      <w:r>
-        <w:rPr>
-          <w:i/>
-        </w:rPr>
-        <w:t xml:space="preserve"> </w:t>
-      </w:r>
-      <w:r>
-        <w:rPr>
-          <w:i/>
-        </w:rPr>
-        <w:t xml:space="preserve">of</w:t>
-      </w:r>
-      <w:r>
-        <w:rPr>
-          <w:i/>
-        </w:rPr>
-        <w:t xml:space="preserve"> </w:t>
-      </w:r>
-      <w:r>
-        <w:rPr>
-          <w:i/>
-        </w:rPr>
-        <w:t xml:space="preserve">Alton</w:t>
-      </w:r>
-      <w:r>
-        <w:t xml:space="preserve">,</w:t>
-      </w:r>
-      <w:r>
-        <w:br/>
-      </w:r>
-      <w:r>
-        <w:t xml:space="preserve">539</w:t>
-      </w:r>
-      <w:r>
-        <w:t xml:space="preserve"> </w:t>
-      </w:r>
-      <w:r>
-        <w:t xml:space="preserve">F.3d</w:t>
-      </w:r>
-      <w:r>
-        <w:t xml:space="preserve"> </w:t>
-      </w:r>
-      <w:r>
-        <w:t xml:space="preserve">724</w:t>
-      </w:r>
-      <w:r>
-        <w:t xml:space="preserve"> </w:t>
-      </w:r>
-      <w:r>
-        <w:t xml:space="preserve">(7th</w:t>
-      </w:r>
-      <w:r>
-        <w:t xml:space="preserve"> </w:t>
-      </w:r>
-      <w:r>
-        <w:t xml:space="preserve">Cir.</w:t>
-      </w:r>
-      <w:r>
-        <w:t xml:space="preserve"> </w:t>
-      </w:r>
-      <w:r>
-        <w:t xml:space="preserve">2008)</w:t>
-      </w:r>
-      <w:r>
-        <w:tab/>
-      </w:r>
-      <w:r>
-        <w:t xml:space="preserve">4</w:t>
-      </w:r>
-    </w:p>
-    <w:p>
-      <w:pPr>
-        <w:pStyle w:val="CAToaEntry"/>
-      </w:pPr>
-      <w:r>
-        <w:rPr>
-          <w:i/>
-        </w:rPr>
-        <w:t xml:space="preserve">California,</w:t>
-      </w:r>
-      <w:r>
-        <w:rPr>
-          <w:i/>
-        </w:rPr>
-        <w:t xml:space="preserve"> </w:t>
-      </w:r>
-      <w:r>
-        <w:rPr>
-          <w:i/>
-        </w:rPr>
-        <w:t xml:space="preserve">et</w:t>
-      </w:r>
-      <w:r>
-        <w:rPr>
-          <w:i/>
-        </w:rPr>
-        <w:t xml:space="preserve"> </w:t>
-      </w:r>
-      <w:r>
-        <w:rPr>
-          <w:i/>
-        </w:rPr>
-        <w:t xml:space="preserve">al. v.</w:t>
-      </w:r>
-      <w:r>
-        <w:rPr>
-          <w:i/>
-        </w:rPr>
-        <w:t xml:space="preserve"> </w:t>
-      </w:r>
-      <w:r>
-        <w:rPr>
-          <w:i/>
-        </w:rPr>
-        <w:t xml:space="preserve">Dep’t</w:t>
-      </w:r>
-      <w:r>
-        <w:rPr>
-          <w:i/>
-        </w:rPr>
-        <w:t xml:space="preserve"> </w:t>
-      </w:r>
-      <w:r>
-        <w:rPr>
-          <w:i/>
-        </w:rPr>
-        <w:t xml:space="preserve">of</w:t>
-      </w:r>
-      <w:r>
-        <w:rPr>
-          <w:i/>
-        </w:rPr>
-        <w:t xml:space="preserve"> </w:t>
-      </w:r>
-      <w:r>
-        <w:rPr>
-          <w:i/>
-        </w:rPr>
-        <w:t xml:space="preserve">Ed.,</w:t>
-      </w:r>
-      <w:r>
-        <w:rPr>
-          <w:i/>
-        </w:rPr>
-        <w:t xml:space="preserve"> </w:t>
-      </w:r>
-      <w:r>
-        <w:rPr>
-          <w:i/>
-        </w:rPr>
-        <w:t xml:space="preserve">et</w:t>
-      </w:r>
-      <w:r>
-        <w:rPr>
-          <w:i/>
-        </w:rPr>
-        <w:t xml:space="preserve"> </w:t>
-      </w:r>
-      <w:r>
-        <w:rPr>
-          <w:i/>
-        </w:rPr>
-        <w:t xml:space="preserve">al.</w:t>
-      </w:r>
-      <w:r>
-        <w:t xml:space="preserve">,</w:t>
-      </w:r>
-      <w:r>
-        <w:br/>
-      </w:r>
-      <w:r>
-        <w:t xml:space="preserve">No. 25-CV-10548,</w:t>
-      </w:r>
-      <w:r>
-        <w:t xml:space="preserve"> </w:t>
-      </w:r>
-      <w:r>
-        <w:t xml:space="preserve">Mem.</w:t>
-      </w:r>
-      <w:r>
-        <w:t xml:space="preserve"> </w:t>
-      </w:r>
-      <w:r>
-        <w:t xml:space="preserve">and</w:t>
-      </w:r>
-      <w:r>
-        <w:t xml:space="preserve"> </w:t>
-      </w:r>
-      <w:r>
-        <w:t xml:space="preserve">Order,</w:t>
-      </w:r>
-      <w:r>
-        <w:t xml:space="preserve"> </w:t>
-      </w:r>
-      <w:r>
-        <w:t xml:space="preserve">ECF</w:t>
-      </w:r>
-      <w:r>
-        <w:t xml:space="preserve"> </w:t>
-      </w:r>
-      <w:r>
-        <w:t xml:space="preserve">No. 176</w:t>
-      </w:r>
-      <w:r>
-        <w:t xml:space="preserve"> </w:t>
-      </w:r>
-      <w:r>
-        <w:t xml:space="preserve">(D.</w:t>
-      </w:r>
-      <w:r>
-        <w:t xml:space="preserve"> </w:t>
-      </w:r>
-      <w:r>
-        <w:t xml:space="preserve">Mass.</w:t>
-      </w:r>
-      <w:r>
-        <w:t xml:space="preserve"> </w:t>
-      </w:r>
-      <w:r>
-        <w:t xml:space="preserve">Sept. 17,</w:t>
-      </w:r>
-      <w:r>
-        <w:t xml:space="preserve"> </w:t>
-      </w:r>
-      <w:r>
-        <w:t xml:space="preserve">2026)</w:t>
-      </w:r>
-      <w:r>
-        <w:tab/>
-      </w:r>
-      <w:r>
-        <w:t xml:space="preserve">2</w:t>
-      </w:r>
-    </w:p>
-    <w:p>
-      <w:pPr>
-        <w:pStyle w:val="CAToaEntry"/>
-      </w:pPr>
-      <w:r>
-        <w:rPr>
-          <w:i/>
-        </w:rPr>
-        <w:t xml:space="preserve">FKFJ,</w:t>
-      </w:r>
-      <w:r>
-        <w:rPr>
-          <w:i/>
-        </w:rPr>
-        <w:t xml:space="preserve"> </w:t>
-      </w:r>
-      <w:r>
-        <w:rPr>
-          <w:i/>
-        </w:rPr>
-        <w:t xml:space="preserve">Inc. v.</w:t>
-      </w:r>
-      <w:r>
-        <w:rPr>
-          <w:i/>
-        </w:rPr>
-        <w:t xml:space="preserve"> </w:t>
-      </w:r>
-      <w:r>
-        <w:rPr>
-          <w:i/>
-        </w:rPr>
-        <w:t xml:space="preserve">Village</w:t>
-      </w:r>
-      <w:r>
-        <w:rPr>
-          <w:i/>
-        </w:rPr>
-        <w:t xml:space="preserve"> </w:t>
-      </w:r>
-      <w:r>
-        <w:rPr>
-          <w:i/>
-        </w:rPr>
-        <w:t xml:space="preserve">of</w:t>
-      </w:r>
-      <w:r>
-        <w:rPr>
-          <w:i/>
-        </w:rPr>
-        <w:t xml:space="preserve"> </w:t>
-      </w:r>
-      <w:r>
-        <w:rPr>
-          <w:i/>
-        </w:rPr>
-        <w:t xml:space="preserve">Worth</w:t>
-      </w:r>
-      <w:r>
-        <w:t xml:space="preserve">,</w:t>
-      </w:r>
-      <w:r>
-        <w:br/>
-      </w:r>
-      <w:r>
-        <w:t xml:space="preserve">11</w:t>
-      </w:r>
-      <w:r>
-        <w:t xml:space="preserve"> </w:t>
-      </w:r>
-      <w:r>
-        <w:t xml:space="preserve">F.4th</w:t>
-      </w:r>
-      <w:r>
-        <w:t xml:space="preserve"> </w:t>
-      </w:r>
-      <w:r>
-        <w:t xml:space="preserve">574</w:t>
-      </w:r>
-      <w:r>
-        <w:t xml:space="preserve"> </w:t>
-      </w:r>
-      <w:r>
-        <w:t xml:space="preserve">(7th</w:t>
-      </w:r>
-      <w:r>
-        <w:t xml:space="preserve"> </w:t>
-      </w:r>
-      <w:r>
-        <w:t xml:space="preserve">Cir.</w:t>
-      </w:r>
-      <w:r>
-        <w:t xml:space="preserve"> </w:t>
-      </w:r>
-      <w:r>
-        <w:t xml:space="preserve">2021)</w:t>
-      </w:r>
-      <w:r>
-        <w:tab/>
-      </w:r>
-      <w:r>
-        <w:t xml:space="preserve">5</w:t>
-      </w:r>
-    </w:p>
-    <w:p>
-      <w:pPr>
-        <w:pStyle w:val="CAToaEntry"/>
-      </w:pPr>
-      <w:r>
-        <w:rPr>
-          <w:i/>
-        </w:rPr>
-        <w:t xml:space="preserve">Nieves</w:t>
-      </w:r>
-      <w:r>
-        <w:rPr>
-          <w:i/>
-        </w:rPr>
-        <w:t xml:space="preserve"> </w:t>
-      </w:r>
-      <w:r>
-        <w:rPr>
-          <w:i/>
-        </w:rPr>
-        <w:t xml:space="preserve">v.</w:t>
-      </w:r>
-      <w:r>
-        <w:rPr>
-          <w:i/>
-        </w:rPr>
-        <w:t xml:space="preserve"> </w:t>
-      </w:r>
-      <w:r>
-        <w:rPr>
-          <w:i/>
-        </w:rPr>
-        <w:t xml:space="preserve">Bartlett</w:t>
-      </w:r>
-      <w:r>
-        <w:t xml:space="preserve">,</w:t>
-      </w:r>
-      <w:r>
-        <w:br/>
-      </w:r>
-      <w:r>
-        <w:t xml:space="preserve">587</w:t>
-      </w:r>
-      <w:r>
-        <w:t xml:space="preserve"> </w:t>
-      </w:r>
-      <w:r>
-        <w:t xml:space="preserve">U.S.</w:t>
-      </w:r>
-      <w:r>
-        <w:t xml:space="preserve"> </w:t>
-      </w:r>
-      <w:r>
-        <w:t xml:space="preserve">391</w:t>
-      </w:r>
-      <w:r>
-        <w:t xml:space="preserve"> </w:t>
-      </w:r>
-      <w:r>
-        <w:t xml:space="preserve">(2019)</w:t>
-      </w:r>
-      <w:r>
-        <w:tab/>
-      </w:r>
-      <w:r>
-        <w:t xml:space="preserve">5</w:t>
-      </w:r>
-    </w:p>
-    <w:p>
-      <w:pPr>
-        <w:pStyle w:val="CAToaEntry"/>
-      </w:pPr>
-      <w:r>
-        <w:rPr>
-          <w:i/>
-        </w:rPr>
-        <w:t xml:space="preserve">Rust</w:t>
-      </w:r>
-      <w:r>
-        <w:rPr>
-          <w:i/>
-        </w:rPr>
-        <w:t xml:space="preserve"> </w:t>
-      </w:r>
-      <w:r>
-        <w:rPr>
-          <w:i/>
-        </w:rPr>
-        <w:t xml:space="preserve">v.</w:t>
-      </w:r>
-      <w:r>
-        <w:rPr>
-          <w:i/>
-        </w:rPr>
-        <w:t xml:space="preserve"> </w:t>
-      </w:r>
-      <w:r>
-        <w:rPr>
-          <w:i/>
-        </w:rPr>
-        <w:t xml:space="preserve">Sullivan</w:t>
-      </w:r>
-      <w:r>
-        <w:t xml:space="preserve">,</w:t>
-      </w:r>
-      <w:r>
-        <w:br/>
-      </w:r>
-      <w:r>
-        <w:t xml:space="preserve">500</w:t>
-      </w:r>
-      <w:r>
-        <w:t xml:space="preserve"> </w:t>
-      </w:r>
-      <w:r>
-        <w:t xml:space="preserve">U.S.</w:t>
-      </w:r>
-      <w:r>
-        <w:t xml:space="preserve"> </w:t>
-      </w:r>
-      <w:r>
-        <w:t xml:space="preserve">173</w:t>
-      </w:r>
-      <w:r>
-        <w:t xml:space="preserve"> </w:t>
-      </w:r>
-      <w:r>
-        <w:t xml:space="preserve">(1991)</w:t>
-      </w:r>
-      <w:r>
-        <w:tab/>
-      </w:r>
-      <w:r>
-        <w:t xml:space="preserve">5</w:t>
-      </w:r>
-    </w:p>
-    <w:p>
-      <w:pPr>
+        <w:spacing w:before="0" w:after="0" w:line="20" w:lineRule="exact"/>
         <w:sectPr>
-          <w:footerReference w:type="default" r:id="rIdRomanFtr"/>
+          <w:footerReference w:type="default" r:id="rIdFtrPage"/>
+          <w:type w:val="nextPage"/>
           <w:pgSz w:w="12240" w:h="15840"/>
           <w:pgMar w:top="1440" w:right="1440" w:bottom="1440" w:left="1440" w:header="720" w:footer="720" w:gutter="0"/>
           <w:pgNumType w:fmt="lowerRoman"/>
@@ -3367,6 +3720,228 @@
     </w:p>
     <w:p>
       <w:pPr>
+        <w:pStyle w:val="CAHeadL3S2"/>
+        <w:keepNext/>
+      </w:pPr>
+      <w:r>
+        <w:t xml:space="preserve">B.</w:t>
+      </w:r>
+      <w:r>
+        <w:tab/>
+      </w:r>
+      <w:r>
+        <w:t xml:space="preserve">Even</w:t>
+      </w:r>
+      <w:r>
+        <w:t xml:space="preserve"> </w:t>
+      </w:r>
+      <w:r>
+        <w:t xml:space="preserve">if</w:t>
+      </w:r>
+      <w:r>
+        <w:t xml:space="preserve"> </w:t>
+      </w:r>
+      <w:r>
+        <w:t xml:space="preserve">the</w:t>
+      </w:r>
+      <w:r>
+        <w:t xml:space="preserve"> </w:t>
+      </w:r>
+      <w:r>
+        <w:t xml:space="preserve">Department</w:t>
+      </w:r>
+      <w:r>
+        <w:t xml:space="preserve"> </w:t>
+      </w:r>
+      <w:r>
+        <w:t xml:space="preserve">Was</w:t>
+      </w:r>
+      <w:r>
+        <w:t xml:space="preserve"> </w:t>
+      </w:r>
+      <w:r>
+        <w:t xml:space="preserve">Enforcing</w:t>
+      </w:r>
+      <w:r>
+        <w:t xml:space="preserve"> </w:t>
+      </w:r>
+      <w:r>
+        <w:t xml:space="preserve">a</w:t>
+      </w:r>
+      <w:r>
+        <w:t xml:space="preserve"> </w:t>
+      </w:r>
+      <w:r>
+        <w:t xml:space="preserve">Funding</w:t>
+      </w:r>
+      <w:r>
+        <w:t xml:space="preserve"> </w:t>
+      </w:r>
+      <w:r>
+        <w:t xml:space="preserve">Condition</w:t>
+      </w:r>
+      <w:r>
+        <w:t xml:space="preserve"> </w:t>
+      </w:r>
+      <w:r>
+        <w:t xml:space="preserve">Imposed</w:t>
+      </w:r>
+      <w:r>
+        <w:t xml:space="preserve"> </w:t>
+      </w:r>
+      <w:r>
+        <w:t xml:space="preserve">by</w:t>
+      </w:r>
+      <w:r>
+        <w:t xml:space="preserve"> </w:t>
+      </w:r>
+      <w:r>
+        <w:t xml:space="preserve">Congress,</w:t>
+      </w:r>
+      <w:r>
+        <w:t xml:space="preserve"> </w:t>
+      </w:r>
+      <w:r>
+        <w:t xml:space="preserve">Such</w:t>
+      </w:r>
+      <w:r>
+        <w:t xml:space="preserve"> </w:t>
+      </w:r>
+      <w:r>
+        <w:t xml:space="preserve">a</w:t>
+      </w:r>
+      <w:r>
+        <w:t xml:space="preserve"> </w:t>
+      </w:r>
+      <w:r>
+        <w:t xml:space="preserve">Funding</w:t>
+      </w:r>
+      <w:r>
+        <w:t xml:space="preserve"> </w:t>
+      </w:r>
+      <w:r>
+        <w:t xml:space="preserve">Condition</w:t>
+      </w:r>
+      <w:r>
+        <w:t xml:space="preserve"> </w:t>
+      </w:r>
+      <w:r>
+        <w:t xml:space="preserve">Is</w:t>
+      </w:r>
+      <w:r>
+        <w:t xml:space="preserve"> </w:t>
+      </w:r>
+      <w:r>
+        <w:t xml:space="preserve">Viewpoint</w:t>
+      </w:r>
+      <w:r>
+        <w:t xml:space="preserve"> </w:t>
+      </w:r>
+      <w:r>
+        <w:t xml:space="preserve">Discrimination</w:t>
+      </w:r>
+      <w:r>
+        <w:t xml:space="preserve"> </w:t>
+      </w:r>
+      <w:r>
+        <w:t xml:space="preserve">Prohibited</w:t>
+      </w:r>
+      <w:r>
+        <w:t xml:space="preserve"> </w:t>
+      </w:r>
+      <w:r>
+        <w:t xml:space="preserve">Under</w:t>
+      </w:r>
+      <w:r>
+        <w:t xml:space="preserve"> </w:t>
+      </w:r>
+      <w:r>
+        <w:t xml:space="preserve">the</w:t>
+      </w:r>
+      <w:r>
+        <w:t xml:space="preserve"> </w:t>
+      </w:r>
+      <w:r>
+        <w:t xml:space="preserve">Selective-Subsidy</w:t>
+      </w:r>
+      <w:r>
+        <w:t xml:space="preserve"> </w:t>
+      </w:r>
+      <w:r>
+        <w:t xml:space="preserve">Cases.</w:t>
+      </w:r>
+    </w:p>
+    <w:p>
+      <w:pPr>
+        <w:pStyle w:val="BodyText"/>
+      </w:pPr>
+      <w:r>
+        <w:rPr>
+          <w:i/>
+          <w:iCs/>
+        </w:rPr>
+        <w:t xml:space="preserve">[Transcription note: the text of Point II.B is not transcribed here.]</w:t>
+      </w:r>
+    </w:p>
+    <w:p>
+      <w:pPr>
+        <w:pStyle w:val="CAHeadL3S2"/>
+        <w:keepNext/>
+      </w:pPr>
+      <w:r>
+        <w:t xml:space="preserve">C.</w:t>
+      </w:r>
+      <w:r>
+        <w:tab/>
+      </w:r>
+      <w:r>
+        <w:t xml:space="preserve">Plaintiffs</w:t>
+      </w:r>
+      <w:r>
+        <w:t xml:space="preserve"> </w:t>
+      </w:r>
+      <w:r>
+        <w:t xml:space="preserve">Did</w:t>
+      </w:r>
+      <w:r>
+        <w:t xml:space="preserve"> </w:t>
+      </w:r>
+      <w:r>
+        <w:t xml:space="preserve">Not</w:t>
+      </w:r>
+      <w:r>
+        <w:t xml:space="preserve"> </w:t>
+      </w:r>
+      <w:r>
+        <w:t xml:space="preserve">Waive</w:t>
+      </w:r>
+      <w:r>
+        <w:t xml:space="preserve"> </w:t>
+      </w:r>
+      <w:r>
+        <w:t xml:space="preserve">Their</w:t>
+      </w:r>
+      <w:r>
+        <w:t xml:space="preserve"> </w:t>
+      </w:r>
+      <w:r>
+        <w:t xml:space="preserve">Argument.</w:t>
+      </w:r>
+    </w:p>
+    <w:p>
+      <w:pPr>
+        <w:pStyle w:val="BodyText"/>
+      </w:pPr>
+      <w:r>
+        <w:rPr>
+          <w:i/>
+          <w:iCs/>
+        </w:rPr>
+        <w:t xml:space="preserve">[Transcription note: the text of Point II.C is not transcribed here.]</w:t>
+      </w:r>
+    </w:p>
+    <w:p>
+      <w:pPr>
         <w:pStyle w:val="CAHeadL2S1"/>
         <w:keepNext/>
       </w:pPr>
@@ -3377,6 +3952,99 @@
         <w:tab/>
       </w:r>
       <w:r>
+        <w:t xml:space="preserve">The</w:t>
+      </w:r>
+      <w:r>
+        <w:t xml:space="preserve"> </w:t>
+      </w:r>
+      <w:r>
+        <w:t xml:space="preserve">Court</w:t>
+      </w:r>
+      <w:r>
+        <w:t xml:space="preserve"> </w:t>
+      </w:r>
+      <w:r>
+        <w:t xml:space="preserve">Erred</w:t>
+      </w:r>
+      <w:r>
+        <w:t xml:space="preserve"> </w:t>
+      </w:r>
+      <w:r>
+        <w:t xml:space="preserve">in</w:t>
+      </w:r>
+      <w:r>
+        <w:t xml:space="preserve"> </w:t>
+      </w:r>
+      <w:r>
+        <w:t xml:space="preserve">Failing</w:t>
+      </w:r>
+      <w:r>
+        <w:t xml:space="preserve"> </w:t>
+      </w:r>
+      <w:r>
+        <w:t xml:space="preserve">to</w:t>
+      </w:r>
+      <w:r>
+        <w:t xml:space="preserve"> </w:t>
+      </w:r>
+      <w:r>
+        <w:t xml:space="preserve">Make</w:t>
+      </w:r>
+      <w:r>
+        <w:t xml:space="preserve"> </w:t>
+      </w:r>
+      <w:r>
+        <w:t xml:space="preserve">any</w:t>
+      </w:r>
+      <w:r>
+        <w:t xml:space="preserve"> </w:t>
+      </w:r>
+      <w:r>
+        <w:t xml:space="preserve">Findings</w:t>
+      </w:r>
+      <w:r>
+        <w:t xml:space="preserve"> </w:t>
+      </w:r>
+      <w:r>
+        <w:t xml:space="preserve">of</w:t>
+      </w:r>
+      <w:r>
+        <w:t xml:space="preserve"> </w:t>
+      </w:r>
+      <w:r>
+        <w:t xml:space="preserve">Irreparable</w:t>
+      </w:r>
+      <w:r>
+        <w:t xml:space="preserve"> </w:t>
+      </w:r>
+      <w:r>
+        <w:t xml:space="preserve">Harm.</w:t>
+      </w:r>
+    </w:p>
+    <w:p>
+      <w:pPr>
+        <w:pStyle w:val="BodyText"/>
+      </w:pPr>
+      <w:r>
+        <w:rPr>
+          <w:i/>
+          <w:iCs/>
+        </w:rPr>
+        <w:t xml:space="preserve">[Transcription note: the text of Point III is not transcribed here.]</w:t>
+      </w:r>
+    </w:p>
+    <w:p>
+      <w:pPr>
+        <w:pStyle w:val="CAHeadL2S1"/>
+        <w:keepNext/>
+      </w:pPr>
+      <w:r>
+        <w:t xml:space="preserve">IV.</w:t>
+      </w:r>
+      <w:r>
+        <w:tab/>
+      </w:r>
+      <w:r>
         <w:t xml:space="preserve">Conclusion</w:t>
       </w:r>
     </w:p>
@@ -3617,7 +4285,7 @@
         <w:pStyle w:val="CACertificate"/>
       </w:pPr>
       <w:r>
-        <w:t xml:space="preserve">I certify that this brief complies with the type-volume limit of Fed. R. App. P. 32(a)(7)(B), as modified by Cir. R. 32(c). Excluding the parts of the brief exempted by Fed. R. App. P. 32(f), this brief contains 2,085 words.</w:t>
+        <w:t xml:space="preserve">I certify that this brief complies with the type-volume limit of Fed. R. App. P. 32(a)(7)(B), as modified by Cir. R. 32(c). Excluding the parts of the brief exempted by Fed. R. App. P. 32(f), this brief contains 2,160 words.</w:t>
       </w:r>
     </w:p>
     <w:p>
@@ -3625,7 +4293,7 @@
         <w:pStyle w:val="CACertificate"/>
       </w:pPr>
       <w:r>
-        <w:t xml:space="preserve">I further certify that this brief complies with the typeface requirements of Fed. R. App. P. 32(a)(5) and the type-style requirements of Fed. R. App. P. 32(a)(6), as modified by Cir. R. 32(b). This brief has been prepared in a proportionally spaced typeface, EB Garamond, in 12-point type for the body text and 11-point type for the footnotes.</w:t>
+        <w:t xml:space="preserve">I further certify that this brief complies with the typeface requirements of Fed. R. App. P. 32(a)(5) and the type-style requirements of Fed. R. App. P. 32(a)(6), as modified by Cir. R. 32(b). This brief has been prepared in a proportionally spaced typeface using Microsoft Word in 12-point Times New Roman for the body text and 11-point Times New Roman for the footnotes.</w:t>
       </w:r>
     </w:p>
     <w:p>
@@ -3842,7 +4510,8 @@
       </w:tr>
     </w:tbl>
     <w:sectPr>
-      <w:footerReference w:type="default" r:id="rIdArabicFtr"/>
+      <w:footerReference w:type="default" r:id="rIdFtrPage"/>
+      <w:type w:val="nextPage"/>
       <w:pgSz w:w="12240" w:h="15840"/>
       <w:pgMar w:top="1440" w:right="1440" w:bottom="1440" w:left="1440" w:header="720" w:footer="720" w:gutter="0"/>
       <w:pgNumType w:fmt="decimal" w:start="1"/>
@@ -3855,14 +4524,211 @@
 <w:comments xmlns:w="http://schemas.openxmlformats.org/wordprocessingml/2006/main" xmlns:m="http://schemas.openxmlformats.org/officeDocument/2006/math" xmlns:r="http://schemas.openxmlformats.org/officeDocument/2006/relationships" xmlns:o="urn:schemas-microsoft-com:office:office" xmlns:v="urn:schemas-microsoft-com:vml" xmlns:w10="urn:schemas-microsoft-com:office:word" xmlns:a="http://schemas.openxmlformats.org/drawingml/2006/main" xmlns:pic="http://schemas.openxmlformats.org/drawingml/2006/picture" xmlns:wp="http://schemas.openxmlformats.org/drawingml/2006/wordprocessingDrawing"/>
 </file>
 
-<file path=word/footer-arabic.xml><?xml version="1.0" encoding="utf-8"?>
+<file path=word/footnotes.xml><?xml version="1.0" encoding="utf-8"?>
+<w:footnotes xmlns:w="http://schemas.openxmlformats.org/wordprocessingml/2006/main" xmlns:m="http://schemas.openxmlformats.org/officeDocument/2006/math" xmlns:r="http://schemas.openxmlformats.org/officeDocument/2006/relationships" xmlns:o="urn:schemas-microsoft-com:office:office" xmlns:v="urn:schemas-microsoft-com:vml" xmlns:w10="urn:schemas-microsoft-com:office:word" xmlns:a="http://schemas.openxmlformats.org/drawingml/2006/main" xmlns:pic="http://schemas.openxmlformats.org/drawingml/2006/picture" xmlns:wp="http://schemas.openxmlformats.org/drawingml/2006/wordprocessingDrawing">
+  <w:footnote w:type="continuationSeparator" w:id="0">
+    <w:p>
+      <w:r>
+        <w:continuationSeparator/>
+      </w:r>
+    </w:p>
+  </w:footnote>
+  <w:footnote w:type="separator" w:id="-1">
+    <w:p>
+      <w:r>
+        <w:separator/>
+      </w:r>
+    </w:p>
+  </w:footnote>
+  <w:footnote w:id="9">
+    <w:p>
+      <w:pPr>
+        <w:pStyle w:val="FootnoteText"/>
+      </w:pPr>
+      <w:r>
+        <w:rPr>
+          <w:rStyle w:val="FootnoteReference"/>
+        </w:rPr>
+        <w:footnoteRef/>
+      </w:r>
+      <w:r>
+        <w:t xml:space="preserve"> </w:t>
+      </w:r>
+      <w:r>
+        <w:t xml:space="preserve">This is consistent with the Department’s February 2025 Directive prioritizing viewpoint-driven review of “organizations that support diversity, equity, and inclusion . . .” (Dkt. 49-22 at 2.) Last week, a district court granted summary judgment to plaintiffs challenging that Directive, vacating it and declaring it substantively unlawful under the APA.</w:t>
+      </w:r>
+      <w:r>
+        <w:t xml:space="preserve"> </w:t>
+      </w:r>
+      <w:r>
+        <w:rPr>
+          <w:i/>
+          <w:iCs/>
+        </w:rPr>
+        <w:t xml:space="preserve">California, et al. v. Dep’t of Ed., et al.</w:t>
+      </w:r>
+      <w:r>
+        <w:t xml:space="preserve">, No. 25-CV-10548, Mem. and Order, ECF No. 176 (D. Mass. Sept. 17, 2026).</w:t>
+      </w:r>
+    </w:p>
+  </w:footnote>
+  <w:footnote w:id="10">
+    <w:p>
+      <w:pPr>
+        <w:pStyle w:val="FootnoteText"/>
+      </w:pPr>
+      <w:r>
+        <w:rPr>
+          <w:rStyle w:val="FootnoteReference"/>
+        </w:rPr>
+        <w:footnoteRef/>
+      </w:r>
+      <w:r>
+        <w:t xml:space="preserve"> </w:t>
+      </w:r>
+      <w:r>
+        <w:t xml:space="preserve">That truncated mission statement—“[E]quity is intentionally and sustainably integrated into all that we do[.]”—was the district court’s only record cite with regard to ACT Now’s rural grant. (Br. 21 (citing Dkt. 62 at 2).)</w:t>
+      </w:r>
+    </w:p>
+  </w:footnote>
+  <w:footnote w:id="11">
+    <w:p>
+      <w:pPr>
+        <w:pStyle w:val="FootnoteText"/>
+      </w:pPr>
+      <w:r>
+        <w:rPr>
+          <w:rStyle w:val="FootnoteReference"/>
+        </w:rPr>
+        <w:footnoteRef/>
+      </w:r>
+      <w:r>
+        <w:t xml:space="preserve"> </w:t>
+      </w:r>
+      <w:r>
+        <w:t xml:space="preserve">Defendants attempt to collapse Plaintiffs’ affirmative arguments into a factual dispute subject to clear-error review. (Resp. Br. 22–28.) But the district court did not err only in the facts; it erred in failing to apply the relevant constitutional law at all. (Br. 13–14 (describing how the court’s “false premise” regarding “DEI-related projects” led it to apply the selective-subsidy cases and reach the wrong conclusion.).) The district court never mentioned in its memorandum denying ACT Now’s preliminary injunction, let alone analyzed, ACT Now’s likelihood of success under the three-part test that governs retaliation claims:</w:t>
+      </w:r>
+      <w:r>
+        <w:t xml:space="preserve"> </w:t>
+      </w:r>
+      <w:r>
+        <w:rPr>
+          <w:i/>
+          <w:iCs/>
+        </w:rPr>
+        <w:t xml:space="preserve">Nieves v. Bartlett</w:t>
+      </w:r>
+      <w:r>
+        <w:t xml:space="preserve">, 587 U.S. 391 (2019) and</w:t>
+      </w:r>
+      <w:r>
+        <w:t xml:space="preserve"> </w:t>
+      </w:r>
+      <w:r>
+        <w:rPr>
+          <w:i/>
+          <w:iCs/>
+        </w:rPr>
+        <w:t xml:space="preserve">FKFJ, Inc. v. Village of Worth</w:t>
+      </w:r>
+      <w:r>
+        <w:t xml:space="preserve">, 11 F.4th 574 (7th Cir. 2021) do not appear in its opinion. That is an error of law that requires reversal.</w:t>
+      </w:r>
+    </w:p>
+  </w:footnote>
+  <w:footnote w:id="12">
+    <w:p>
+      <w:pPr>
+        <w:pStyle w:val="FootnoteText"/>
+      </w:pPr>
+      <w:r>
+        <w:rPr>
+          <w:rStyle w:val="FootnoteReference"/>
+        </w:rPr>
+        <w:footnoteRef/>
+      </w:r>
+      <w:r>
+        <w:t xml:space="preserve"> </w:t>
+      </w:r>
+      <w:r>
+        <w:t xml:space="preserve">Resp. Br. 16 (“In Rust, . . . [t]he Supreme Court upheld the implementing regulations because they reflected Congress’s prerogative to define the program’s contours….”) (emphasis added);</w:t>
+      </w:r>
+      <w:r>
+        <w:t xml:space="preserve"> </w:t>
+      </w:r>
+      <w:r>
+        <w:rPr>
+          <w:i/>
+          <w:iCs/>
+        </w:rPr>
+        <w:t xml:space="preserve">id.</w:t>
+      </w:r>
+      <w:r>
+        <w:t xml:space="preserve"> </w:t>
+      </w:r>
+      <w:r>
+        <w:t xml:space="preserve">at 17 (quoting</w:t>
+      </w:r>
+      <w:r>
+        <w:t xml:space="preserve"> </w:t>
+      </w:r>
+      <w:r>
+        <w:rPr>
+          <w:i/>
+          <w:iCs/>
+        </w:rPr>
+        <w:t xml:space="preserve">Finley</w:t>
+      </w:r>
+      <w:r>
+        <w:t xml:space="preserve">, 524 U.S. at 587–88) (“So long as legislation does not infringe on other constitutionally protected rights, Congress has wide latitude to set spending priorities.”) (emphasized added);</w:t>
+      </w:r>
+      <w:r>
+        <w:t xml:space="preserve"> </w:t>
+      </w:r>
+      <w:r>
+        <w:rPr>
+          <w:i/>
+          <w:iCs/>
+        </w:rPr>
+        <w:t xml:space="preserve">id.</w:t>
+      </w:r>
+      <w:r>
+        <w:t xml:space="preserve"> </w:t>
+      </w:r>
+      <w:r>
+        <w:t xml:space="preserve">at 20 (“The Supreme Court [in Rust] upheld the regulations as valid interpretations of statutory authority…”) (emphasis added);</w:t>
+      </w:r>
+      <w:r>
+        <w:t xml:space="preserve"> </w:t>
+      </w:r>
+      <w:r>
+        <w:rPr>
+          <w:i/>
+          <w:iCs/>
+        </w:rPr>
+        <w:t xml:space="preserve">id</w:t>
+      </w:r>
+      <w:r>
+        <w:t xml:space="preserve"> </w:t>
+      </w:r>
+      <w:r>
+        <w:t xml:space="preserve">at 21 (“In [Finley], the National Endowment for the Arts was directed by Congress to consider ‘general standards of decency and respect’ in issuing grants. . . . [T]he Supreme Court held [that] the agency could constitutionally exercise ‘substantial discretion’ in applying those broad statutory criteria.”) (emphasis added)).</w:t>
+      </w:r>
+    </w:p>
+  </w:footnote>
+</w:footnotes>
+</file>
+
+<file path=word/ftr-add.xml><?xml version="1.0" encoding="utf-8"?>
 <w:ftr xmlns:w="http://schemas.openxmlformats.org/wordprocessingml/2006/main" xmlns:r="http://schemas.openxmlformats.org/officeDocument/2006/relationships">
   <w:p>
     <w:pPr>
-      <w:spacing w:before="0" w:after="0" w:line="240" w:lineRule="auto"/>
-      <w:ind w:firstLine="0"/>
+      <w:spacing w:before="0" w:after="0"/>
       <w:jc w:val="center"/>
     </w:pPr>
+    <w:r>
+      <w:t>Add-</w:t>
+    </w:r>
     <w:r>
       <w:fldChar w:fldCharType="begin"/>
     </w:r>
@@ -3882,12 +4748,22 @@
 </w:ftr>
 </file>
 
-<file path=word/footer-roman.xml><?xml version="1.0" encoding="utf-8"?>
+<file path=word/ftr-none.xml><?xml version="1.0" encoding="utf-8"?>
 <w:ftr xmlns:w="http://schemas.openxmlformats.org/wordprocessingml/2006/main" xmlns:r="http://schemas.openxmlformats.org/officeDocument/2006/relationships">
   <w:p>
     <w:pPr>
-      <w:spacing w:before="0" w:after="0" w:line="240" w:lineRule="auto"/>
-      <w:ind w:firstLine="0"/>
+      <w:spacing w:before="0" w:after="0"/>
+      <w:jc w:val="center"/>
+    </w:pPr>
+  </w:p>
+</w:ftr>
+</file>
+
+<file path=word/ftr-page.xml><?xml version="1.0" encoding="utf-8"?>
+<w:ftr xmlns:w="http://schemas.openxmlformats.org/wordprocessingml/2006/main" xmlns:r="http://schemas.openxmlformats.org/officeDocument/2006/relationships">
+  <w:p>
+    <w:pPr>
+      <w:spacing w:before="0" w:after="0"/>
       <w:jc w:val="center"/>
     </w:pPr>
     <w:r>
@@ -3909,201 +4785,6 @@
 </w:ftr>
 </file>
 
-<file path=word/footnotes.xml><?xml version="1.0" encoding="utf-8"?>
-<w:footnotes xmlns:w="http://schemas.openxmlformats.org/wordprocessingml/2006/main" xmlns:m="http://schemas.openxmlformats.org/officeDocument/2006/math" xmlns:r="http://schemas.openxmlformats.org/officeDocument/2006/relationships" xmlns:o="urn:schemas-microsoft-com:office:office" xmlns:v="urn:schemas-microsoft-com:vml" xmlns:w10="urn:schemas-microsoft-com:office:word" xmlns:a="http://schemas.openxmlformats.org/drawingml/2006/main" xmlns:pic="http://schemas.openxmlformats.org/drawingml/2006/picture" xmlns:wp="http://schemas.openxmlformats.org/drawingml/2006/wordprocessingDrawing">
-  <w:footnote w:type="continuationSeparator" w:id="0">
-    <w:p>
-      <w:r>
-        <w:continuationSeparator/>
-      </w:r>
-    </w:p>
-  </w:footnote>
-  <w:footnote w:type="separator" w:id="-1">
-    <w:p>
-      <w:r>
-        <w:separator/>
-      </w:r>
-    </w:p>
-  </w:footnote>
-  <w:footnote w:id="9">
-    <w:p>
-      <w:pPr>
-        <w:pStyle w:val="FootnoteText"/>
-      </w:pPr>
-      <w:r>
-        <w:rPr>
-          <w:rStyle w:val="FootnoteReference"/>
-        </w:rPr>
-        <w:footnoteRef/>
-      </w:r>
-      <w:r>
-        <w:t xml:space="preserve"> </w:t>
-      </w:r>
-      <w:r>
-        <w:t xml:space="preserve">This is consistent with the Department’s February 2025 Directive prioritizing viewpoint-driven review of “organizations that support diversity, equity, and inclusion . . .” (Dkt. 49-22 at 2.) Last week, a district court granted summary judgment to plaintiffs challenging that Directive, vacating it and declaring it substantively unlawful under the APA.</w:t>
-      </w:r>
-      <w:r>
-        <w:t xml:space="preserve"> </w:t>
-      </w:r>
-      <w:r>
-        <w:rPr>
-          <w:i/>
-          <w:iCs/>
-        </w:rPr>
-        <w:t xml:space="preserve">California, et al. v. Dep’t of Ed., et al.</w:t>
-      </w:r>
-      <w:r>
-        <w:t xml:space="preserve">, No. 25-CV-10548, Mem. and Order, ECF No. 176 (D. Mass. Sept. 17, 2026).</w:t>
-      </w:r>
-    </w:p>
-  </w:footnote>
-  <w:footnote w:id="10">
-    <w:p>
-      <w:pPr>
-        <w:pStyle w:val="FootnoteText"/>
-      </w:pPr>
-      <w:r>
-        <w:rPr>
-          <w:rStyle w:val="FootnoteReference"/>
-        </w:rPr>
-        <w:footnoteRef/>
-      </w:r>
-      <w:r>
-        <w:t xml:space="preserve"> </w:t>
-      </w:r>
-      <w:r>
-        <w:t xml:space="preserve">That truncated mission statement—“[E]quity is intentionally and sustainably integrated into all that we do[.]”—was the district court’s only record cite with regard to ACT Now’s rural grant. (Br. 21 (citing Dkt. 62 at 2).)</w:t>
-      </w:r>
-    </w:p>
-  </w:footnote>
-  <w:footnote w:id="11">
-    <w:p>
-      <w:pPr>
-        <w:pStyle w:val="FootnoteText"/>
-      </w:pPr>
-      <w:r>
-        <w:rPr>
-          <w:rStyle w:val="FootnoteReference"/>
-        </w:rPr>
-        <w:footnoteRef/>
-      </w:r>
-      <w:r>
-        <w:t xml:space="preserve"> </w:t>
-      </w:r>
-      <w:r>
-        <w:t xml:space="preserve">Defendants attempt to collapse Plaintiffs’ affirmative arguments into a factual dispute subject to clear-error review. (Resp. Br. 22–28.) But the district court did not err only in the facts; it erred in failing to apply the relevant constitutional law at all. (Br. 13–14 (describing how the court’s “false premise” regarding “DEI-related projects” led it to apply the selective-subsidy cases and reach the wrong conclusion.).) The district court never mentioned in its memorandum denying ACT Now’s preliminary injunction, let alone analyzed, ACT Now’s likelihood of success under the three-part test that governs retaliation claims:</w:t>
-      </w:r>
-      <w:r>
-        <w:t xml:space="preserve"> </w:t>
-      </w:r>
-      <w:r>
-        <w:rPr>
-          <w:i/>
-          <w:iCs/>
-        </w:rPr>
-        <w:t xml:space="preserve">Nieves v. Bartlett</w:t>
-      </w:r>
-      <w:r>
-        <w:t xml:space="preserve">, 587 U.S. 391 (2019) and</w:t>
-      </w:r>
-      <w:r>
-        <w:t xml:space="preserve"> </w:t>
-      </w:r>
-      <w:r>
-        <w:rPr>
-          <w:i/>
-          <w:iCs/>
-        </w:rPr>
-        <w:t xml:space="preserve">FKFJ, Inc. v. Village of Worth</w:t>
-      </w:r>
-      <w:r>
-        <w:t xml:space="preserve">, 11 F.4th 574 (7th Cir. 2021) do not appear in its opinion. That is an error of law that requires reversal.</w:t>
-      </w:r>
-    </w:p>
-  </w:footnote>
-  <w:footnote w:id="12">
-    <w:p>
-      <w:pPr>
-        <w:pStyle w:val="FootnoteText"/>
-      </w:pPr>
-      <w:r>
-        <w:rPr>
-          <w:rStyle w:val="FootnoteReference"/>
-        </w:rPr>
-        <w:footnoteRef/>
-      </w:r>
-      <w:r>
-        <w:t xml:space="preserve"> </w:t>
-      </w:r>
-      <w:r>
-        <w:t xml:space="preserve">Resp. Br. 16 (“In Rust, . . . [t]he Supreme Court upheld the implementing regulations because they reflected Congress’s prerogative to define the program’s contours….”) (emphasis added);</w:t>
-      </w:r>
-      <w:r>
-        <w:t xml:space="preserve"> </w:t>
-      </w:r>
-      <w:r>
-        <w:rPr>
-          <w:i/>
-          <w:iCs/>
-        </w:rPr>
-        <w:t xml:space="preserve">id.</w:t>
-      </w:r>
-      <w:r>
-        <w:t xml:space="preserve"> </w:t>
-      </w:r>
-      <w:r>
-        <w:t xml:space="preserve">at 17 (quoting</w:t>
-      </w:r>
-      <w:r>
-        <w:t xml:space="preserve"> </w:t>
-      </w:r>
-      <w:r>
-        <w:rPr>
-          <w:i/>
-          <w:iCs/>
-        </w:rPr>
-        <w:t xml:space="preserve">Finley</w:t>
-      </w:r>
-      <w:r>
-        <w:t xml:space="preserve">, 524 U.S. at 587–88) (“So long as legislation does not infringe on other constitutionally protected rights, Congress has wide latitude to set spending priorities.”) (emphasized added);</w:t>
-      </w:r>
-      <w:r>
-        <w:t xml:space="preserve"> </w:t>
-      </w:r>
-      <w:r>
-        <w:rPr>
-          <w:i/>
-          <w:iCs/>
-        </w:rPr>
-        <w:t xml:space="preserve">id.</w:t>
-      </w:r>
-      <w:r>
-        <w:t xml:space="preserve"> </w:t>
-      </w:r>
-      <w:r>
-        <w:t xml:space="preserve">at 20 (“The Supreme Court [in Rust] upheld the regulations as valid interpretations of statutory authority…”) (emphasis added);</w:t>
-      </w:r>
-      <w:r>
-        <w:t xml:space="preserve"> </w:t>
-      </w:r>
-      <w:r>
-        <w:rPr>
-          <w:i/>
-          <w:iCs/>
-        </w:rPr>
-        <w:t xml:space="preserve">id</w:t>
-      </w:r>
-      <w:r>
-        <w:t xml:space="preserve"> </w:t>
-      </w:r>
-      <w:r>
-        <w:t xml:space="preserve">at 21 (“In [Finley], the National Endowment for the Arts was directed by Congress to consider ‘general standards of decency and respect’ in issuing grants. . . . [T]he Supreme Court held [that] the agency could constitutionally exercise ‘substantial discretion’ in applying those broad statutory criteria.”) (emphasis added)).</w:t>
-      </w:r>
-    </w:p>
-  </w:footnote>
-</w:footnotes>
-</file>
-
 <file path=word/numbering.xml><?xml version="1.0" encoding="utf-8"?>
 <w:numbering xmlns:w="http://schemas.openxmlformats.org/wordprocessingml/2006/main">
   <w:abstractNum w:abstractNumId="990">
@@ -4193,7 +4874,7 @@
   <w:docDefaults>
     <w:rPrDefault>
       <w:rPr>
-        <w:rFonts w:ascii="EB Garamond" w:hAnsi="EB Garamond" w:eastAsia="EB Garamond" w:cs="EB Garamond"/>
+        <w:rFonts w:ascii="Times New Roman" w:hAnsi="Times New Roman" w:eastAsia="Times New Roman" w:cs="Times New Roman"/>
         <w:sz w:val="24"/>
         <w:szCs w:val="24"/>
         <w:lang w:val="en-US" w:eastAsia="en-US" w:bidi="ar-SA"/>
@@ -4207,6 +4888,45 @@
     </w:pPrDefault>
   </w:docDefaults>
   <w:latentStyles w:defLockedState="0" w:defUIPriority="0" w:defSemiHidden="0" w:defUnhideWhenUsed="0" w:defQFormat="0" w:count="276"/>
+  <w:style w:type="paragraph" w:styleId="Normal">
+    <w:name w:val="Normal"/>
+    <w:qFormat/>
+    <w:pPr>
+      <w:widowControl/>
+      <w:spacing w:before="0" w:after="0" w:line="240" w:lineRule="auto"/>
+      <w:ind w:firstLine="0"/>
+    </w:pPr>
+    <w:rPr/>
+  </w:style>
+  <w:style w:type="paragraph" w:styleId="BodyText">
+    <w:name w:val="Body Text"/>
+    <w:basedOn w:val="Normal"/>
+    <w:qFormat/>
+    <w:pPr>
+      <w:widowControl/>
+      <w:spacing w:before="0" w:after="0" w:line="553" w:lineRule="exact"/>
+      <w:ind w:firstLine="720"/>
+      <w:jc w:val="left"/>
+    </w:pPr>
+    <w:rPr/>
+  </w:style>
+  <w:style w:type="paragraph" w:styleId="FirstParagraph">
+    <w:name w:val="First Paragraph"/>
+    <w:basedOn w:val="BodyText"/>
+    <w:qFormat/>
+    <w:pPr/>
+    <w:rPr/>
+  </w:style>
+  <w:style w:type="paragraph" w:styleId="Compact">
+    <w:name w:val="Compact"/>
+    <w:basedOn w:val="Normal"/>
+    <w:qFormat/>
+    <w:pPr>
+      <w:spacing w:before="0" w:after="0" w:line="240" w:lineRule="auto"/>
+      <w:ind w:firstLine="0"/>
+    </w:pPr>
+    <w:rPr/>
+  </w:style>
   <w:style w:type="paragraph" w:styleId="Title">
     <w:name w:val="Title"/>
     <w:basedOn w:val="Normal"/>
@@ -4221,7 +4941,7 @@
       <w:jc w:val="center"/>
     </w:pPr>
     <w:rPr>
-      <w:rFonts w:asciiTheme="majorHAnsi" w:eastAsiaTheme="majorEastAsia" w:hAnsiTheme="majorHAnsi" w:cstheme="majorBidi"/>
+      <w:rFonts w:cstheme="majorBidi"/>
       <w:sz w:val="56"/>
       <w:szCs w:val="56"/>
     </w:rPr>
@@ -4233,7 +4953,7 @@
     <w:uiPriority w:val="10"/>
     <w:rsid w:val="00A10FD9"/>
     <w:rPr>
-      <w:rFonts w:asciiTheme="majorHAnsi" w:eastAsiaTheme="majorEastAsia" w:hAnsiTheme="majorHAnsi" w:cstheme="majorBidi"/>
+      <w:rFonts w:cstheme="majorBidi"/>
       <w:sz w:val="56"/>
       <w:szCs w:val="56"/>
     </w:rPr>
@@ -4252,7 +4972,7 @@
       </w:numPr>
     </w:pPr>
     <w:rPr>
-      <w:rFonts w:eastAsiaTheme="majorEastAsia" w:cstheme="majorBidi"/>
+      <w:rFonts w:cstheme="majorBidi"/>
       <w:spacing w:val="15"/>
       <w:sz w:val="28"/>
       <w:szCs w:val="28"/>
@@ -4265,7 +4985,7 @@
     <w:uiPriority w:val="11"/>
     <w:rsid w:val="00A10FD9"/>
     <w:rPr>
-      <w:rFonts w:eastAsiaTheme="majorEastAsia" w:cstheme="majorBidi"/>
+      <w:rFonts w:cstheme="majorBidi"/>
       <w:color w:val="595959" w:themeColor="text1" w:themeTint="A6"/>
       <w:spacing w:val="15"/>
       <w:sz w:val="28"/>
@@ -4339,6 +5059,83 @@
     <w:qFormat/>
     <w:pPr/>
     <w:rPr/>
+  </w:style>
+  <w:style w:type="paragraph" w:styleId="Heading1">
+    <w:name w:val="heading 1"/>
+    <w:basedOn w:val="Normal"/>
+    <w:qFormat/>
+    <w:pPr>
+      <w:keepNext/>
+      <w:keepLines/>
+      <w:spacing w:before="300" w:after="200" w:line="240" w:lineRule="auto"/>
+      <w:ind w:firstLine="0"/>
+      <w:jc w:val="center"/>
+      <w:outlineLvl w:val="0"/>
+    </w:pPr>
+    <w:rPr>
+      <w:b/>
+      <w:caps/>
+    </w:rPr>
+  </w:style>
+  <w:style w:type="paragraph" w:styleId="Heading2">
+    <w:name w:val="heading 2"/>
+    <w:basedOn w:val="Normal"/>
+    <w:qFormat/>
+    <w:pPr>
+      <w:keepNext/>
+      <w:keepLines/>
+      <w:spacing w:before="240" w:after="200" w:line="240" w:lineRule="auto"/>
+      <w:ind w:firstLine="0"/>
+      <w:outlineLvl w:val="1"/>
+    </w:pPr>
+    <w:rPr>
+      <w:b/>
+    </w:rPr>
+  </w:style>
+  <w:style w:type="paragraph" w:styleId="Heading3">
+    <w:name w:val="heading 3"/>
+    <w:basedOn w:val="Normal"/>
+    <w:qFormat/>
+    <w:pPr>
+      <w:keepNext/>
+      <w:keepLines/>
+      <w:spacing w:before="240" w:after="200" w:line="240" w:lineRule="auto"/>
+      <w:ind w:firstLine="0"/>
+      <w:outlineLvl w:val="2"/>
+    </w:pPr>
+    <w:rPr>
+      <w:b/>
+    </w:rPr>
+  </w:style>
+  <w:style w:type="paragraph" w:styleId="Heading4">
+    <w:name w:val="heading 4"/>
+    <w:basedOn w:val="Normal"/>
+    <w:qFormat/>
+    <w:pPr>
+      <w:keepNext/>
+      <w:keepLines/>
+      <w:spacing w:before="240" w:after="200" w:line="240" w:lineRule="auto"/>
+      <w:ind w:firstLine="0"/>
+      <w:outlineLvl w:val="3"/>
+    </w:pPr>
+    <w:rPr>
+      <w:b/>
+    </w:rPr>
+  </w:style>
+  <w:style w:type="paragraph" w:styleId="Heading5">
+    <w:name w:val="heading 5"/>
+    <w:basedOn w:val="Normal"/>
+    <w:qFormat/>
+    <w:pPr>
+      <w:keepNext/>
+      <w:keepLines/>
+      <w:spacing w:before="240" w:after="200" w:line="240" w:lineRule="auto"/>
+      <w:ind w:firstLine="0"/>
+      <w:outlineLvl w:val="4"/>
+    </w:pPr>
+    <w:rPr>
+      <w:b/>
+    </w:rPr>
   </w:style>
   <w:style w:type="paragraph" w:styleId="Heading6">
     <w:name w:val="heading 6"/>
@@ -4357,7 +5154,7 @@
       <w:outlineLvl w:val="5"/>
     </w:pPr>
     <w:rPr>
-      <w:rFonts w:eastAsiaTheme="majorEastAsia" w:cstheme="majorBidi"/>
+      <w:rFonts w:cstheme="majorBidi"/>
       <w:i/>
       <w:iCs/>
       <w:color w:val="595959" w:themeColor="text1" w:themeTint="A6"/>
@@ -4380,7 +5177,7 @@
       <w:outlineLvl w:val="6"/>
     </w:pPr>
     <w:rPr>
-      <w:rFonts w:eastAsiaTheme="majorEastAsia" w:cstheme="majorBidi"/>
+      <w:rFonts w:cstheme="majorBidi"/>
       <w:color w:val="595959" w:themeColor="text1" w:themeTint="A6"/>
     </w:rPr>
   </w:style>
@@ -4401,7 +5198,7 @@
       <w:outlineLvl w:val="7"/>
     </w:pPr>
     <w:rPr>
-      <w:rFonts w:eastAsiaTheme="majorEastAsia" w:cstheme="majorBidi"/>
+      <w:rFonts w:cstheme="majorBidi"/>
       <w:i/>
       <w:iCs/>
       <w:color w:val="272727" w:themeColor="text1" w:themeTint="D8"/>
@@ -4424,7 +5221,7 @@
       <w:outlineLvl w:val="8"/>
     </w:pPr>
     <w:rPr>
-      <w:rFonts w:eastAsiaTheme="majorEastAsia" w:cstheme="majorBidi"/>
+      <w:rFonts w:cstheme="majorBidi"/>
       <w:color w:val="272727" w:themeColor="text1" w:themeTint="D8"/>
     </w:rPr>
   </w:style>
@@ -4435,7 +5232,7 @@
     <w:uiPriority w:val="9"/>
     <w:rsid w:val="00A10FD9"/>
     <w:rPr>
-      <w:rFonts w:asciiTheme="majorHAnsi" w:eastAsiaTheme="majorEastAsia" w:hAnsiTheme="majorHAnsi" w:cstheme="majorBidi"/>
+      <w:rFonts w:cstheme="majorBidi"/>
       <w:color w:val="0F4761" w:themeColor="accent1" w:themeShade="BF"/>
       <w:sz w:val="40"/>
       <w:szCs w:val="40"/>
@@ -4449,7 +5246,7 @@
     <w:semiHidden/>
     <w:rsid w:val="00A10FD9"/>
     <w:rPr>
-      <w:rFonts w:asciiTheme="majorHAnsi" w:eastAsiaTheme="majorEastAsia" w:hAnsiTheme="majorHAnsi" w:cstheme="majorBidi"/>
+      <w:rFonts w:cstheme="majorBidi"/>
       <w:color w:val="0F4761" w:themeColor="accent1" w:themeShade="BF"/>
       <w:sz w:val="32"/>
       <w:szCs w:val="32"/>
@@ -4463,7 +5260,7 @@
     <w:semiHidden/>
     <w:rsid w:val="00A10FD9"/>
     <w:rPr>
-      <w:rFonts w:eastAsiaTheme="majorEastAsia" w:cstheme="majorBidi"/>
+      <w:rFonts w:cstheme="majorBidi"/>
       <w:color w:val="0F4761" w:themeColor="accent1" w:themeShade="BF"/>
       <w:sz w:val="28"/>
       <w:szCs w:val="28"/>
@@ -4477,7 +5274,7 @@
     <w:semiHidden/>
     <w:rsid w:val="00A10FD9"/>
     <w:rPr>
-      <w:rFonts w:eastAsiaTheme="majorEastAsia" w:cstheme="majorBidi"/>
+      <w:rFonts w:cstheme="majorBidi"/>
       <w:i/>
       <w:iCs/>
       <w:color w:val="0F4761" w:themeColor="accent1" w:themeShade="BF"/>
@@ -4491,7 +5288,7 @@
     <w:semiHidden/>
     <w:rsid w:val="00A10FD9"/>
     <w:rPr>
-      <w:rFonts w:eastAsiaTheme="majorEastAsia" w:cstheme="majorBidi"/>
+      <w:rFonts w:cstheme="majorBidi"/>
       <w:color w:val="0F4761" w:themeColor="accent1" w:themeShade="BF"/>
     </w:rPr>
   </w:style>
@@ -4503,7 +5300,7 @@
     <w:semiHidden/>
     <w:rsid w:val="00A10FD9"/>
     <w:rPr>
-      <w:rFonts w:eastAsiaTheme="majorEastAsia" w:cstheme="majorBidi"/>
+      <w:rFonts w:cstheme="majorBidi"/>
       <w:i/>
       <w:iCs/>
       <w:color w:val="595959" w:themeColor="text1" w:themeTint="A6"/>
@@ -4517,7 +5314,7 @@
     <w:semiHidden/>
     <w:rsid w:val="00A10FD9"/>
     <w:rPr>
-      <w:rFonts w:eastAsiaTheme="majorEastAsia" w:cstheme="majorBidi"/>
+      <w:rFonts w:cstheme="majorBidi"/>
       <w:color w:val="595959" w:themeColor="text1" w:themeTint="A6"/>
     </w:rPr>
   </w:style>
@@ -4529,7 +5326,7 @@
     <w:semiHidden/>
     <w:rsid w:val="00A10FD9"/>
     <w:rPr>
-      <w:rFonts w:eastAsiaTheme="majorEastAsia" w:cstheme="majorBidi"/>
+      <w:rFonts w:cstheme="majorBidi"/>
       <w:i/>
       <w:iCs/>
       <w:color w:val="272727" w:themeColor="text1" w:themeTint="D8"/>
@@ -4543,8 +5340,31 @@
     <w:semiHidden/>
     <w:rsid w:val="00A10FD9"/>
     <w:rPr>
-      <w:rFonts w:eastAsiaTheme="majorEastAsia" w:cstheme="majorBidi"/>
+      <w:rFonts w:cstheme="majorBidi"/>
       <w:color w:val="272727" w:themeColor="text1" w:themeTint="D8"/>
+    </w:rPr>
+  </w:style>
+  <w:style w:type="paragraph" w:styleId="BlockText">
+    <w:name w:val="Block Text"/>
+    <w:basedOn w:val="Normal"/>
+    <w:qFormat/>
+    <w:pPr>
+      <w:spacing w:before="240" w:after="240" w:line="240" w:lineRule="auto"/>
+      <w:ind w:left="720" w:right="720" w:firstLine="0"/>
+    </w:pPr>
+    <w:rPr/>
+  </w:style>
+  <w:style w:type="paragraph" w:styleId="FootnoteText">
+    <w:name w:val="footnote text"/>
+    <w:basedOn w:val="Normal"/>
+    <w:qFormat/>
+    <w:pPr>
+      <w:spacing w:before="0" w:after="120" w:line="240" w:lineRule="auto"/>
+      <w:ind w:firstLine="0"/>
+    </w:pPr>
+    <w:rPr>
+      <w:sz w:val="22"/>
+      <w:szCs w:val="22"/>
     </w:rPr>
   </w:style>
   <w:style w:type="paragraph" w:styleId="FootnoteBlockText">
@@ -4664,7 +5484,7 @@
     <w:name w:val="Hyperlink"/>
     <w:basedOn w:val="BodyTextChar"/>
     <w:rPr>
-      <w:color w:val="4F81BD" w:themeColor="accent1"/>
+      <w:color w:val="000000"/>
     </w:rPr>
   </w:style>
   <w:style w:type="paragraph" w:styleId="TOCHeading">
@@ -4679,40 +5499,11 @@
       <w:outlineLvl w:val="9"/>
     </w:pPr>
     <w:rPr>
-      <w:rFonts w:asciiTheme="majorHAnsi" w:eastAsiaTheme="majorEastAsia" w:hAnsiTheme="majorHAnsi" w:cstheme="majorBidi"/>
+      <w:rFonts w:cstheme="majorBidi"/>
       <w:b w:val="0"/>
       <w:bCs w:val="0"/>
       <w:color w:val="365F91" w:themeColor="accent1" w:themeShade="BF"/>
     </w:rPr>
-  </w:style>
-  <w:style w:type="paragraph" w:styleId="Normal">
-    <w:name w:val="Normal"/>
-    <w:qFormat/>
-    <w:pPr>
-      <w:widowControl/>
-      <w:spacing w:before="0" w:after="0" w:line="240" w:lineRule="auto"/>
-      <w:ind w:firstLine="0"/>
-    </w:pPr>
-    <w:rPr/>
-  </w:style>
-  <w:style w:type="paragraph" w:styleId="BodyText">
-    <w:name w:val="Body Text"/>
-    <w:basedOn w:val="Normal"/>
-    <w:qFormat/>
-    <w:pPr>
-      <w:widowControl/>
-      <w:spacing w:before="0" w:after="0" w:line="553" w:lineRule="exact"/>
-      <w:ind w:firstLine="720"/>
-      <w:jc w:val="left"/>
-    </w:pPr>
-    <w:rPr/>
-  </w:style>
-  <w:style w:type="paragraph" w:styleId="FirstParagraph">
-    <w:name w:val="First Paragraph"/>
-    <w:basedOn w:val="BodyText"/>
-    <w:qFormat/>
-    <w:pPr/>
-    <w:rPr/>
   </w:style>
   <w:style w:type="paragraph" w:customStyle="1" w:styleId="CABodyLast">
     <w:name w:val="CA Body Last"/>
@@ -4722,116 +5513,6 @@
       <w:keepNext/>
     </w:pPr>
     <w:rPr/>
-  </w:style>
-  <w:style w:type="paragraph" w:styleId="Compact">
-    <w:name w:val="Compact"/>
-    <w:basedOn w:val="Normal"/>
-    <w:qFormat/>
-    <w:pPr>
-      <w:spacing w:before="0" w:after="0" w:line="240" w:lineRule="auto"/>
-      <w:ind w:firstLine="0"/>
-    </w:pPr>
-    <w:rPr/>
-  </w:style>
-  <w:style w:type="paragraph" w:styleId="BlockText">
-    <w:name w:val="Block Text"/>
-    <w:basedOn w:val="Normal"/>
-    <w:qFormat/>
-    <w:pPr>
-      <w:spacing w:before="240" w:after="240" w:line="240" w:lineRule="auto"/>
-      <w:ind w:left="720" w:right="720" w:firstLine="0"/>
-    </w:pPr>
-    <w:rPr/>
-  </w:style>
-  <w:style w:type="paragraph" w:styleId="FootnoteText">
-    <w:name w:val="footnote text"/>
-    <w:basedOn w:val="Normal"/>
-    <w:qFormat/>
-    <w:pPr>
-      <w:spacing w:before="0" w:after="120" w:line="240" w:lineRule="auto"/>
-      <w:ind w:firstLine="0"/>
-    </w:pPr>
-    <w:rPr>
-      <w:sz w:val="22"/>
-      <w:szCs w:val="22"/>
-    </w:rPr>
-  </w:style>
-  <w:style w:type="paragraph" w:styleId="Heading1">
-    <w:name w:val="heading 1"/>
-    <w:basedOn w:val="Normal"/>
-    <w:qFormat/>
-    <w:pPr>
-      <w:keepNext/>
-      <w:keepLines/>
-      <w:spacing w:before="300" w:after="200" w:line="240" w:lineRule="auto"/>
-      <w:ind w:firstLine="0"/>
-      <w:jc w:val="center"/>
-      <w:outlineLvl w:val="0"/>
-    </w:pPr>
-    <w:rPr>
-      <w:b/>
-      <w:caps/>
-    </w:rPr>
-  </w:style>
-  <w:style w:type="paragraph" w:styleId="Heading2">
-    <w:name w:val="heading 2"/>
-    <w:basedOn w:val="Normal"/>
-    <w:qFormat/>
-    <w:pPr>
-      <w:keepNext/>
-      <w:keepLines/>
-      <w:spacing w:before="240" w:after="200" w:line="240" w:lineRule="auto"/>
-      <w:ind w:firstLine="0"/>
-      <w:outlineLvl w:val="1"/>
-    </w:pPr>
-    <w:rPr>
-      <w:b/>
-    </w:rPr>
-  </w:style>
-  <w:style w:type="paragraph" w:styleId="Heading3">
-    <w:name w:val="heading 3"/>
-    <w:basedOn w:val="Normal"/>
-    <w:qFormat/>
-    <w:pPr>
-      <w:keepNext/>
-      <w:keepLines/>
-      <w:spacing w:before="240" w:after="200" w:line="240" w:lineRule="auto"/>
-      <w:ind w:firstLine="0"/>
-      <w:outlineLvl w:val="2"/>
-    </w:pPr>
-    <w:rPr>
-      <w:b/>
-    </w:rPr>
-  </w:style>
-  <w:style w:type="paragraph" w:styleId="Heading4">
-    <w:name w:val="heading 4"/>
-    <w:basedOn w:val="Normal"/>
-    <w:qFormat/>
-    <w:pPr>
-      <w:keepNext/>
-      <w:keepLines/>
-      <w:spacing w:before="240" w:after="200" w:line="240" w:lineRule="auto"/>
-      <w:ind w:firstLine="0"/>
-      <w:outlineLvl w:val="3"/>
-    </w:pPr>
-    <w:rPr>
-      <w:b/>
-    </w:rPr>
-  </w:style>
-  <w:style w:type="paragraph" w:styleId="Heading5">
-    <w:name w:val="heading 5"/>
-    <w:basedOn w:val="Normal"/>
-    <w:qFormat/>
-    <w:pPr>
-      <w:keepNext/>
-      <w:keepLines/>
-      <w:spacing w:before="240" w:after="200" w:line="240" w:lineRule="auto"/>
-      <w:ind w:firstLine="0"/>
-      <w:outlineLvl w:val="4"/>
-    </w:pPr>
-    <w:rPr>
-      <w:b/>
-    </w:rPr>
   </w:style>
   <w:style w:type="paragraph" w:customStyle="1" w:styleId="CASection">
     <w:name w:val="CA Section"/>
@@ -5773,7 +6454,7 @@
     </a:clrScheme>
     <a:fontScheme name="Office">
       <a:majorFont>
-        <a:latin typeface="Aptos Display" panose="02110004020202020204"/>
+        <a:latin typeface="Times New Roman" panose="02110004020202020204"/>
         <a:ea typeface=""/>
         <a:cs typeface=""/>
         <a:font script="Jpan" typeface="游ゴシック Light"/>
@@ -5825,7 +6506,7 @@
         <a:font script="Tfng" typeface="Ebrima"/>
       </a:majorFont>
       <a:minorFont>
-        <a:latin typeface="Aptos" panose="02110004020202020204"/>
+        <a:latin typeface="Times New Roman" panose="02110004020202020204"/>
         <a:ea typeface=""/>
         <a:cs typeface=""/>
         <a:font script="Jpan" typeface="游明朝"/>

</xml_diff>